<commit_message>
doc: add pass and fail conditions to the overview
Co-Authored-By: Claude Sonnet 5.5 <noreply@anthropic.com>
Claude-Session: https://claude.ai/code/session_0176yVfn6cAho71EZe1GaZ57
</commit_message>
<xml_diff>
--- a/Doc/IHT-MK1_Overview.docx
+++ b/Doc/IHT-MK1_Overview.docx
@@ -1562,7 +1562,7 @@
           <w:sz w:val="20"/>
           <w:szCs w:val="20"/>
         </w:rPr>
-        <w:t xml:space="preserve">connected reads low, open reads near 3.3 V. It runs in two modes: verify (check the netlist pairs) and discover (scan every pair).</w:t>
+        <w:t xml:space="preserve">connected reads in the 1.3–1.7 V band, open reads near 3.3 V (see section 5). It runs in two modes: verify (check the netlist pairs) and discover (scan every pair).</w:t>
       </w:r>
     </w:p>
     <w:p>
@@ -1927,7 +1927,593 @@
           <w:sz w:val="28"/>
           <w:szCs w:val="28"/>
         </w:rPr>
-        <w:t xml:space="preserve">5. Support Tools</w:t>
+        <w:t xml:space="preserve">5. Pass and fail conditions</w:t>
+      </w:r>
+    </w:p>
+    <w:tbl>
+      <w:tblPr>
+        <w:tblW w:type="dxa" w:w="9906"/>
+        <w:tblBorders>
+          <w:top w:val="single" w:color="auto" w:sz="4"/>
+          <w:left w:val="single" w:color="auto" w:sz="4"/>
+          <w:bottom w:val="single" w:color="auto" w:sz="4"/>
+          <w:right w:val="single" w:color="auto" w:sz="4"/>
+          <w:insideH w:val="single" w:color="auto" w:sz="4"/>
+          <w:insideV w:val="single" w:color="auto" w:sz="4"/>
+        </w:tblBorders>
+      </w:tblPr>
+      <w:tblGrid>
+        <w:gridCol w:w="1500"/>
+        <w:gridCol w:w="2900"/>
+        <w:gridCol w:w="3100"/>
+        <w:gridCol w:w="2406"/>
+      </w:tblGrid>
+      <w:tr>
+        <w:trPr>
+          <w:tblHeader/>
+        </w:trPr>
+        <w:tc>
+          <w:tcPr>
+            <w:tcW w:type="dxa" w:w="1500"/>
+            <w:tcBorders>
+              <w:top w:val="single" w:color="BFC5CC" w:sz="4"/>
+              <w:left w:val="single" w:color="BFC5CC" w:sz="4"/>
+              <w:bottom w:val="single" w:color="BFC5CC" w:sz="4"/>
+              <w:right w:val="single" w:color="BFC5CC" w:sz="4"/>
+            </w:tcBorders>
+            <w:shd w:fill="E3E9F1" w:color="auto" w:val="clear"/>
+            <w:tcMar>
+              <w:top w:type="dxa" w:w="60"/>
+              <w:left w:type="dxa" w:w="100"/>
+              <w:bottom w:type="dxa" w:w="60"/>
+              <w:right w:type="dxa" w:w="100"/>
+            </w:tcMar>
+          </w:tcPr>
+          <w:p>
+            <w:pPr>
+              <w:spacing w:after="20"/>
+            </w:pPr>
+            <w:r>
+              <w:rPr>
+                <w:rFonts w:ascii="Arial" w:cs="Arial" w:eastAsia="Arial" w:hAnsi="Arial"/>
+                <w:b/>
+                <w:bCs/>
+                <w:sz w:val="18"/>
+                <w:szCs w:val="18"/>
+              </w:rPr>
+              <w:t xml:space="preserve">Test</w:t>
+            </w:r>
+          </w:p>
+        </w:tc>
+        <w:tc>
+          <w:tcPr>
+            <w:tcW w:type="dxa" w:w="2900"/>
+            <w:tcBorders>
+              <w:top w:val="single" w:color="BFC5CC" w:sz="4"/>
+              <w:left w:val="single" w:color="BFC5CC" w:sz="4"/>
+              <w:bottom w:val="single" w:color="BFC5CC" w:sz="4"/>
+              <w:right w:val="single" w:color="BFC5CC" w:sz="4"/>
+            </w:tcBorders>
+            <w:shd w:fill="E3E9F1" w:color="auto" w:val="clear"/>
+            <w:tcMar>
+              <w:top w:type="dxa" w:w="60"/>
+              <w:left w:type="dxa" w:w="100"/>
+              <w:bottom w:type="dxa" w:w="60"/>
+              <w:right w:type="dxa" w:w="100"/>
+            </w:tcMar>
+          </w:tcPr>
+          <w:p>
+            <w:pPr>
+              <w:spacing w:after="20"/>
+            </w:pPr>
+            <w:r>
+              <w:rPr>
+                <w:rFonts w:ascii="Arial" w:cs="Arial" w:eastAsia="Arial" w:hAnsi="Arial"/>
+                <w:b/>
+                <w:bCs/>
+                <w:sz w:val="18"/>
+                <w:szCs w:val="18"/>
+              </w:rPr>
+              <w:t xml:space="preserve">PASS</w:t>
+            </w:r>
+          </w:p>
+        </w:tc>
+        <w:tc>
+          <w:tcPr>
+            <w:tcW w:type="dxa" w:w="3100"/>
+            <w:tcBorders>
+              <w:top w:val="single" w:color="BFC5CC" w:sz="4"/>
+              <w:left w:val="single" w:color="BFC5CC" w:sz="4"/>
+              <w:bottom w:val="single" w:color="BFC5CC" w:sz="4"/>
+              <w:right w:val="single" w:color="BFC5CC" w:sz="4"/>
+            </w:tcBorders>
+            <w:shd w:fill="E3E9F1" w:color="auto" w:val="clear"/>
+            <w:tcMar>
+              <w:top w:type="dxa" w:w="60"/>
+              <w:left w:type="dxa" w:w="100"/>
+              <w:bottom w:type="dxa" w:w="60"/>
+              <w:right w:type="dxa" w:w="100"/>
+            </w:tcMar>
+          </w:tcPr>
+          <w:p>
+            <w:pPr>
+              <w:spacing w:after="20"/>
+            </w:pPr>
+            <w:r>
+              <w:rPr>
+                <w:rFonts w:ascii="Arial" w:cs="Arial" w:eastAsia="Arial" w:hAnsi="Arial"/>
+                <w:b/>
+                <w:bCs/>
+                <w:sz w:val="18"/>
+                <w:szCs w:val="18"/>
+              </w:rPr>
+              <w:t xml:space="preserve">FAIL</w:t>
+            </w:r>
+          </w:p>
+        </w:tc>
+        <w:tc>
+          <w:tcPr>
+            <w:tcW w:type="dxa" w:w="2406"/>
+            <w:tcBorders>
+              <w:top w:val="single" w:color="BFC5CC" w:sz="4"/>
+              <w:left w:val="single" w:color="BFC5CC" w:sz="4"/>
+              <w:bottom w:val="single" w:color="BFC5CC" w:sz="4"/>
+              <w:right w:val="single" w:color="BFC5CC" w:sz="4"/>
+            </w:tcBorders>
+            <w:shd w:fill="E3E9F1" w:color="auto" w:val="clear"/>
+            <w:tcMar>
+              <w:top w:type="dxa" w:w="60"/>
+              <w:left w:type="dxa" w:w="100"/>
+              <w:bottom w:type="dxa" w:w="60"/>
+              <w:right w:type="dxa" w:w="100"/>
+            </w:tcMar>
+          </w:tcPr>
+          <w:p>
+            <w:pPr>
+              <w:spacing w:after="20"/>
+            </w:pPr>
+            <w:r>
+              <w:rPr>
+                <w:rFonts w:ascii="Arial" w:cs="Arial" w:eastAsia="Arial" w:hAnsi="Arial"/>
+                <w:b/>
+                <w:bCs/>
+                <w:sz w:val="18"/>
+                <w:szCs w:val="18"/>
+              </w:rPr>
+              <w:t xml:space="preserve">Other</w:t>
+            </w:r>
+          </w:p>
+        </w:tc>
+      </w:tr>
+      <w:tr>
+        <w:trPr>
+          <w:cantSplit/>
+        </w:trPr>
+        <w:tc>
+          <w:tcPr>
+            <w:tcW w:type="dxa" w:w="1500"/>
+            <w:tcBorders>
+              <w:top w:val="single" w:color="BFC5CC" w:sz="4"/>
+              <w:left w:val="single" w:color="BFC5CC" w:sz="4"/>
+              <w:bottom w:val="single" w:color="BFC5CC" w:sz="4"/>
+              <w:right w:val="single" w:color="BFC5CC" w:sz="4"/>
+            </w:tcBorders>
+            <w:tcMar>
+              <w:top w:type="dxa" w:w="60"/>
+              <w:left w:type="dxa" w:w="100"/>
+              <w:bottom w:type="dxa" w:w="60"/>
+              <w:right w:type="dxa" w:w="100"/>
+            </w:tcMar>
+          </w:tcPr>
+          <w:p>
+            <w:pPr>
+              <w:spacing w:after="20"/>
+            </w:pPr>
+            <w:r>
+              <w:rPr>
+                <w:rFonts w:ascii="Arial" w:cs="Arial" w:eastAsia="Arial" w:hAnsi="Arial"/>
+                <w:b w:val="false"/>
+                <w:bCs w:val="false"/>
+                <w:sz w:val="18"/>
+                <w:szCs w:val="18"/>
+              </w:rPr>
+              <w:t xml:space="preserve">Continuity</w:t>
+            </w:r>
+          </w:p>
+        </w:tc>
+        <w:tc>
+          <w:tcPr>
+            <w:tcW w:type="dxa" w:w="2900"/>
+            <w:tcBorders>
+              <w:top w:val="single" w:color="BFC5CC" w:sz="4"/>
+              <w:left w:val="single" w:color="BFC5CC" w:sz="4"/>
+              <w:bottom w:val="single" w:color="BFC5CC" w:sz="4"/>
+              <w:right w:val="single" w:color="BFC5CC" w:sz="4"/>
+            </w:tcBorders>
+            <w:tcMar>
+              <w:top w:type="dxa" w:w="60"/>
+              <w:left w:type="dxa" w:w="100"/>
+              <w:bottom w:type="dxa" w:w="60"/>
+              <w:right w:type="dxa" w:w="100"/>
+            </w:tcMar>
+          </w:tcPr>
+          <w:p>
+            <w:pPr>
+              <w:spacing w:after="20"/>
+            </w:pPr>
+            <w:r>
+              <w:rPr>
+                <w:rFonts w:ascii="Arial" w:cs="Arial" w:eastAsia="Arial" w:hAnsi="Arial"/>
+                <w:b w:val="false"/>
+                <w:bCs w:val="false"/>
+                <w:sz w:val="18"/>
+                <w:szCs w:val="18"/>
+              </w:rPr>
+              <w:t xml:space="preserve">ADC input between 1.3 V and 1.7 V (wire present).</w:t>
+            </w:r>
+          </w:p>
+        </w:tc>
+        <w:tc>
+          <w:tcPr>
+            <w:tcW w:type="dxa" w:w="3100"/>
+            <w:tcBorders>
+              <w:top w:val="single" w:color="BFC5CC" w:sz="4"/>
+              <w:left w:val="single" w:color="BFC5CC" w:sz="4"/>
+              <w:bottom w:val="single" w:color="BFC5CC" w:sz="4"/>
+              <w:right w:val="single" w:color="BFC5CC" w:sz="4"/>
+            </w:tcBorders>
+            <w:tcMar>
+              <w:top w:type="dxa" w:w="60"/>
+              <w:left w:type="dxa" w:w="100"/>
+              <w:bottom w:type="dxa" w:w="60"/>
+              <w:right w:type="dxa" w:w="100"/>
+            </w:tcMar>
+          </w:tcPr>
+          <w:p>
+            <w:pPr>
+              <w:spacing w:after="20"/>
+            </w:pPr>
+            <w:r>
+              <w:rPr>
+                <w:rFonts w:ascii="Arial" w:cs="Arial" w:eastAsia="Arial" w:hAnsi="Arial"/>
+                <w:b w:val="false"/>
+                <w:bCs w:val="false"/>
+                <w:sz w:val="18"/>
+                <w:szCs w:val="18"/>
+              </w:rPr>
+              <w:t xml:space="preserve">ADC input at or above 3.0 V: open, no wire. In verify mode, an expected pair that reads open is a fail.</w:t>
+            </w:r>
+          </w:p>
+        </w:tc>
+        <w:tc>
+          <w:tcPr>
+            <w:tcW w:type="dxa" w:w="2406"/>
+            <w:tcBorders>
+              <w:top w:val="single" w:color="BFC5CC" w:sz="4"/>
+              <w:left w:val="single" w:color="BFC5CC" w:sz="4"/>
+              <w:bottom w:val="single" w:color="BFC5CC" w:sz="4"/>
+              <w:right w:val="single" w:color="BFC5CC" w:sz="4"/>
+            </w:tcBorders>
+            <w:tcMar>
+              <w:top w:type="dxa" w:w="60"/>
+              <w:left w:type="dxa" w:w="100"/>
+              <w:bottom w:type="dxa" w:w="60"/>
+              <w:right w:type="dxa" w:w="100"/>
+            </w:tcMar>
+          </w:tcPr>
+          <w:p>
+            <w:pPr>
+              <w:spacing w:after="20"/>
+            </w:pPr>
+            <w:r>
+              <w:rPr>
+                <w:rFonts w:ascii="Arial" w:cs="Arial" w:eastAsia="Arial" w:hAnsi="Arial"/>
+                <w:b w:val="false"/>
+                <w:bCs w:val="false"/>
+                <w:sz w:val="18"/>
+                <w:szCs w:val="18"/>
+              </w:rPr>
+              <w:t xml:space="preserve">Any other voltage is flagged as an error (wiring or relay problem). Discover mode only lists the pairs that pass.</w:t>
+            </w:r>
+          </w:p>
+        </w:tc>
+      </w:tr>
+      <w:tr>
+        <w:trPr>
+          <w:cantSplit/>
+        </w:trPr>
+        <w:tc>
+          <w:tcPr>
+            <w:tcW w:type="dxa" w:w="1500"/>
+            <w:tcBorders>
+              <w:top w:val="single" w:color="BFC5CC" w:sz="4"/>
+              <w:left w:val="single" w:color="BFC5CC" w:sz="4"/>
+              <w:bottom w:val="single" w:color="BFC5CC" w:sz="4"/>
+              <w:right w:val="single" w:color="BFC5CC" w:sz="4"/>
+            </w:tcBorders>
+            <w:tcMar>
+              <w:top w:type="dxa" w:w="60"/>
+              <w:left w:type="dxa" w:w="100"/>
+              <w:bottom w:type="dxa" w:w="60"/>
+              <w:right w:type="dxa" w:w="100"/>
+            </w:tcMar>
+          </w:tcPr>
+          <w:p>
+            <w:pPr>
+              <w:spacing w:after="20"/>
+            </w:pPr>
+            <w:r>
+              <w:rPr>
+                <w:rFonts w:ascii="Arial" w:cs="Arial" w:eastAsia="Arial" w:hAnsi="Arial"/>
+                <w:b w:val="false"/>
+                <w:bCs w:val="false"/>
+                <w:sz w:val="18"/>
+                <w:szCs w:val="18"/>
+              </w:rPr>
+              <w:t xml:space="preserve">Resistance</w:t>
+            </w:r>
+          </w:p>
+        </w:tc>
+        <w:tc>
+          <w:tcPr>
+            <w:tcW w:type="dxa" w:w="2900"/>
+            <w:tcBorders>
+              <w:top w:val="single" w:color="BFC5CC" w:sz="4"/>
+              <w:left w:val="single" w:color="BFC5CC" w:sz="4"/>
+              <w:bottom w:val="single" w:color="BFC5CC" w:sz="4"/>
+              <w:right w:val="single" w:color="BFC5CC" w:sz="4"/>
+            </w:tcBorders>
+            <w:tcMar>
+              <w:top w:type="dxa" w:w="60"/>
+              <w:left w:type="dxa" w:w="100"/>
+              <w:bottom w:type="dxa" w:w="60"/>
+              <w:right w:type="dxa" w:w="100"/>
+            </w:tcMar>
+          </w:tcPr>
+          <w:p>
+            <w:pPr>
+              <w:spacing w:after="20"/>
+            </w:pPr>
+            <w:r>
+              <w:rPr>
+                <w:rFonts w:ascii="Arial" w:cs="Arial" w:eastAsia="Arial" w:hAnsi="Arial"/>
+                <w:b w:val="false"/>
+                <w:bCs w:val="false"/>
+                <w:sz w:val="18"/>
+                <w:szCs w:val="18"/>
+              </w:rPr>
+              <w:t xml:space="preserve">Resistance is at or below the limit (default 5 Ω, set from the GUI).</w:t>
+            </w:r>
+          </w:p>
+        </w:tc>
+        <w:tc>
+          <w:tcPr>
+            <w:tcW w:type="dxa" w:w="3100"/>
+            <w:tcBorders>
+              <w:top w:val="single" w:color="BFC5CC" w:sz="4"/>
+              <w:left w:val="single" w:color="BFC5CC" w:sz="4"/>
+              <w:bottom w:val="single" w:color="BFC5CC" w:sz="4"/>
+              <w:right w:val="single" w:color="BFC5CC" w:sz="4"/>
+            </w:tcBorders>
+            <w:tcMar>
+              <w:top w:type="dxa" w:w="60"/>
+              <w:left w:type="dxa" w:w="100"/>
+              <w:bottom w:type="dxa" w:w="60"/>
+              <w:right w:type="dxa" w:w="100"/>
+            </w:tcMar>
+          </w:tcPr>
+          <w:p>
+            <w:pPr>
+              <w:spacing w:after="20"/>
+            </w:pPr>
+            <w:r>
+              <w:rPr>
+                <w:rFonts w:ascii="Arial" w:cs="Arial" w:eastAsia="Arial" w:hAnsi="Arial"/>
+                <w:b w:val="false"/>
+                <w:bCs w:val="false"/>
+                <w:sz w:val="18"/>
+                <w:szCs w:val="18"/>
+              </w:rPr>
+              <w:t xml:space="preserve">Resistance above the limit, or no reading possible (open circuit: the ADC saturates at every gain).</w:t>
+            </w:r>
+          </w:p>
+        </w:tc>
+        <w:tc>
+          <w:tcPr>
+            <w:tcW w:type="dxa" w:w="2406"/>
+            <w:tcBorders>
+              <w:top w:val="single" w:color="BFC5CC" w:sz="4"/>
+              <w:left w:val="single" w:color="BFC5CC" w:sz="4"/>
+              <w:bottom w:val="single" w:color="BFC5CC" w:sz="4"/>
+              <w:right w:val="single" w:color="BFC5CC" w:sz="4"/>
+            </w:tcBorders>
+            <w:tcMar>
+              <w:top w:type="dxa" w:w="60"/>
+              <w:left w:type="dxa" w:w="100"/>
+              <w:bottom w:type="dxa" w:w="60"/>
+              <w:right w:type="dxa" w:w="100"/>
+            </w:tcMar>
+          </w:tcPr>
+          <w:p>
+            <w:pPr>
+              <w:spacing w:after="20"/>
+            </w:pPr>
+            <w:r>
+              <w:rPr>
+                <w:rFonts w:ascii="Arial" w:cs="Arial" w:eastAsia="Arial" w:hAnsi="Arial"/>
+                <w:b w:val="false"/>
+                <w:bCs w:val="false"/>
+                <w:sz w:val="18"/>
+                <w:szCs w:val="18"/>
+              </w:rPr>
+              <w:t xml:space="preserve">Each point reports the resistance in milliohms.</w:t>
+            </w:r>
+          </w:p>
+        </w:tc>
+      </w:tr>
+      <w:tr>
+        <w:trPr>
+          <w:cantSplit/>
+        </w:trPr>
+        <w:tc>
+          <w:tcPr>
+            <w:tcW w:type="dxa" w:w="1500"/>
+            <w:tcBorders>
+              <w:top w:val="single" w:color="BFC5CC" w:sz="4"/>
+              <w:left w:val="single" w:color="BFC5CC" w:sz="4"/>
+              <w:bottom w:val="single" w:color="BFC5CC" w:sz="4"/>
+              <w:right w:val="single" w:color="BFC5CC" w:sz="4"/>
+            </w:tcBorders>
+            <w:tcMar>
+              <w:top w:type="dxa" w:w="60"/>
+              <w:left w:type="dxa" w:w="100"/>
+              <w:bottom w:type="dxa" w:w="60"/>
+              <w:right w:type="dxa" w:w="100"/>
+            </w:tcMar>
+          </w:tcPr>
+          <w:p>
+            <w:pPr>
+              <w:spacing w:after="20"/>
+            </w:pPr>
+            <w:r>
+              <w:rPr>
+                <w:rFonts w:ascii="Arial" w:cs="Arial" w:eastAsia="Arial" w:hAnsi="Arial"/>
+                <w:b w:val="false"/>
+                <w:bCs w:val="false"/>
+                <w:sz w:val="18"/>
+                <w:szCs w:val="18"/>
+              </w:rPr>
+              <w:t xml:space="preserve">Insulation</w:t>
+            </w:r>
+          </w:p>
+        </w:tc>
+        <w:tc>
+          <w:tcPr>
+            <w:tcW w:type="dxa" w:w="2900"/>
+            <w:tcBorders>
+              <w:top w:val="single" w:color="BFC5CC" w:sz="4"/>
+              <w:left w:val="single" w:color="BFC5CC" w:sz="4"/>
+              <w:bottom w:val="single" w:color="BFC5CC" w:sz="4"/>
+              <w:right w:val="single" w:color="BFC5CC" w:sz="4"/>
+            </w:tcBorders>
+            <w:tcMar>
+              <w:top w:type="dxa" w:w="60"/>
+              <w:left w:type="dxa" w:w="100"/>
+              <w:bottom w:type="dxa" w:w="60"/>
+              <w:right w:type="dxa" w:w="100"/>
+            </w:tcMar>
+          </w:tcPr>
+          <w:p>
+            <w:pPr>
+              <w:spacing w:after="20"/>
+            </w:pPr>
+            <w:r>
+              <w:rPr>
+                <w:rFonts w:ascii="Arial" w:cs="Arial" w:eastAsia="Arial" w:hAnsi="Arial"/>
+                <w:b w:val="false"/>
+                <w:bCs w:val="false"/>
+                <w:sz w:val="18"/>
+                <w:szCs w:val="18"/>
+              </w:rPr>
+              <w:t xml:space="preserve">Leakage voltage below 0.045 V at 500 V, which means insulation above about 10 MΩ.</w:t>
+            </w:r>
+          </w:p>
+        </w:tc>
+        <w:tc>
+          <w:tcPr>
+            <w:tcW w:type="dxa" w:w="3100"/>
+            <w:tcBorders>
+              <w:top w:val="single" w:color="BFC5CC" w:sz="4"/>
+              <w:left w:val="single" w:color="BFC5CC" w:sz="4"/>
+              <w:bottom w:val="single" w:color="BFC5CC" w:sz="4"/>
+              <w:right w:val="single" w:color="BFC5CC" w:sz="4"/>
+            </w:tcBorders>
+            <w:tcMar>
+              <w:top w:type="dxa" w:w="60"/>
+              <w:left w:type="dxa" w:w="100"/>
+              <w:bottom w:type="dxa" w:w="60"/>
+              <w:right w:type="dxa" w:w="100"/>
+            </w:tcMar>
+          </w:tcPr>
+          <w:p>
+            <w:pPr>
+              <w:spacing w:after="20"/>
+            </w:pPr>
+            <w:r>
+              <w:rPr>
+                <w:rFonts w:ascii="Arial" w:cs="Arial" w:eastAsia="Arial" w:hAnsi="Arial"/>
+                <w:b w:val="false"/>
+                <w:bCs w:val="false"/>
+                <w:sz w:val="18"/>
+                <w:szCs w:val="18"/>
+              </w:rPr>
+              <w:t xml:space="preserve">Leakage voltage at or above 0.045 V (insulation below about 10 MΩ). The limit scales with the test voltage.</w:t>
+            </w:r>
+          </w:p>
+        </w:tc>
+        <w:tc>
+          <w:tcPr>
+            <w:tcW w:type="dxa" w:w="2406"/>
+            <w:tcBorders>
+              <w:top w:val="single" w:color="BFC5CC" w:sz="4"/>
+              <w:left w:val="single" w:color="BFC5CC" w:sz="4"/>
+              <w:bottom w:val="single" w:color="BFC5CC" w:sz="4"/>
+              <w:right w:val="single" w:color="BFC5CC" w:sz="4"/>
+            </w:tcBorders>
+            <w:tcMar>
+              <w:top w:type="dxa" w:w="60"/>
+              <w:left w:type="dxa" w:w="100"/>
+              <w:bottom w:type="dxa" w:w="60"/>
+              <w:right w:type="dxa" w:w="100"/>
+            </w:tcMar>
+          </w:tcPr>
+          <w:p>
+            <w:pPr>
+              <w:spacing w:after="20"/>
+            </w:pPr>
+            <w:r>
+              <w:rPr>
+                <w:rFonts w:ascii="Arial" w:cs="Arial" w:eastAsia="Arial" w:hAnsi="Arial"/>
+                <w:b w:val="false"/>
+                <w:bCs w:val="false"/>
+                <w:sz w:val="18"/>
+                <w:szCs w:val="18"/>
+              </w:rPr>
+              <w:t xml:space="preserve">The run is refused if HV is not armed or the HV self-test fails. A measurement error is counted as a fail.</w:t>
+            </w:r>
+          </w:p>
+        </w:tc>
+      </w:tr>
+    </w:tbl>
+    <w:p>
+      <w:pPr>
+        <w:spacing w:after="100" w:before="100"/>
+      </w:pPr>
+      <w:r>
+        <w:rPr>
+          <w:rFonts w:ascii="Arial" w:cs="Arial" w:eastAsia="Arial" w:hAnsi="Arial"/>
+          <w:sz w:val="18"/>
+          <w:szCs w:val="18"/>
+        </w:rPr>
+        <w:t xml:space="preserve">Every run ends with a count of passes and fails. Any fault stops the run and forces the instrument safe.</w:t>
+      </w:r>
+    </w:p>
+    <w:p>
+      <w:pPr>
+        <w:pStyle w:val="Heading1"/>
+        <w:keepNext/>
+        <w:spacing w:after="120" w:before="280"/>
+      </w:pPr>
+      <w:r>
+        <w:rPr>
+          <w:rFonts w:ascii="Arial" w:cs="Arial" w:eastAsia="Arial" w:hAnsi="Arial"/>
+          <w:b/>
+          <w:bCs/>
+          <w:color w:val="1F3A5F"/>
+          <w:sz w:val="28"/>
+          <w:szCs w:val="28"/>
+        </w:rPr>
+        <w:t xml:space="preserve">6. Support Tools</w:t>
       </w:r>
     </w:p>
     <w:tbl>
@@ -2585,7 +3171,7 @@
           <w:sz w:val="28"/>
           <w:szCs w:val="28"/>
         </w:rPr>
-        <w:t xml:space="preserve">6. Pin support</w:t>
+        <w:t xml:space="preserve">7. Pin support</w:t>
       </w:r>
     </w:p>
     <w:p>

</xml_diff>

<commit_message>
fw: fix the continuity thresholds for the real front end
A connected wire pulls the 10 kohm pull-up (R54) down through two muxes, the wire
and R131 (100 ohm): about 0.07-0.23 V, not the old 1.3-1.7 V band, so good wires
were classed as errors. New windows: pass 0.02-0.5 V, open >= 3.0 V, anything
else an error. Classification moved into Continuity_Classify(); docs and the GUI
demo simulator updated to match.

Co-Authored-By: Claude Sonnet 5.5 <noreply@anthropic.com>
Claude-Session: https://claude.ai/code/session_0176yVfn6cAho71EZe1GaZ57
</commit_message>
<xml_diff>
--- a/Doc/IHT-MK1_Overview.docx
+++ b/Doc/IHT-MK1_Overview.docx
@@ -1562,7 +1562,7 @@
           <w:sz w:val="20"/>
           <w:szCs w:val="20"/>
         </w:rPr>
-        <w:t xml:space="preserve">connected reads in the 1.3–1.7 V band, open reads near 3.3 V (see section 5). It runs in two modes: verify (check the netlist pairs) and discover (scan every pair).</w:t>
+        <w:t xml:space="preserve">a connected wire reads low (about 0.1 V, because the 10 kΩ pull-up is shorted through two muxes and 100 Ω); no wire reads near 3.3 V (see section 5). It runs in two modes: verify (check the netlist pairs) and discover (scan every pair).</w:t>
       </w:r>
     </w:p>
     <w:p>
@@ -2149,7 +2149,7 @@
                 <w:sz w:val="18"/>
                 <w:szCs w:val="18"/>
               </w:rPr>
-              <w:t xml:space="preserve">ADC input between 1.3 V and 1.7 V (wire present).</w:t>
+              <w:t xml:space="preserve">ADC input between 0.02 V and 0.5 V (wire present, typically about 0.1 V).</w:t>
             </w:r>
           </w:p>
         </w:tc>
@@ -2213,7 +2213,7 @@
                 <w:sz w:val="18"/>
                 <w:szCs w:val="18"/>
               </w:rPr>
-              <w:t xml:space="preserve">Any other voltage is flagged as an error (wiring or relay problem). Discover mode only lists the pairs that pass.</w:t>
+              <w:t xml:space="preserve">Any other voltage (for example 0 V, or a very high-resistance path) is flagged as an error. Discover mode only lists the pairs that pass.</w:t>
             </w:r>
           </w:p>
         </w:tc>

</xml_diff>